<commit_message>
docs: branch renamed to Everything-good-(sound+audio) (was opt/pi-2026-09-22)
Owner's name for the verified working state: video and audio both good. The image audit reports on the Desktop keep the old name, so the docs mention it once.
</commit_message>
<xml_diff>
--- a/docs/NetBridge-Working-Configuration-2026-09-24.docx
+++ b/docs/NetBridge-Working-Configuration-2026-09-24.docx
@@ -137,7 +137,7 @@
           <w:sz w:val="17"/>
           <w:szCs w:val="17"/>
         </w:rPr>
-        <w:t xml:space="preserve">opt/pi-2026-09-22</w:t>
+        <w:t xml:space="preserve">Everything-good-(sound+audio)</w:t>
       </w:r>
       <w:r>
         <w:rPr>
@@ -982,6 +982,23 @@
                 <w:sz w:val="17"/>
                 <w:szCs w:val="17"/>
               </w:rPr>
+              <w:t xml:space="preserve">Everything-good-(sound+audio)</w:t>
+            </w:r>
+            <w:r>
+              <w:rPr>
+                <w:b w:val="false"/>
+                <w:bCs w:val="false"/>
+              </w:rPr>
+              <w:t xml:space="preserve"> (renamed on 2026-09-24 from </w:t>
+            </w:r>
+            <w:r>
+              <w:rPr>
+                <w:rFonts w:ascii="Menlo" w:cs="Menlo" w:eastAsia="Menlo" w:hAnsi="Menlo"/>
+                <w:b w:val="false"/>
+                <w:bCs w:val="false"/>
+                <w:sz w:val="17"/>
+                <w:szCs w:val="17"/>
+              </w:rPr>
               <w:t xml:space="preserve">opt/pi-2026-09-22</w:t>
             </w:r>
             <w:r>
@@ -989,7 +1006,7 @@
                 <w:b w:val="false"/>
                 <w:bCs w:val="false"/>
               </w:rPr>
-              <w:t xml:space="preserve"> (pushed; </w:t>
+              <w:t xml:space="preserve">, the name used in the image audit reports; pushed; </w:t>
             </w:r>
             <w:r>
               <w:rPr>
@@ -6578,7 +6595,7 @@
           <w:sz w:val="17"/>
           <w:szCs w:val="17"/>
         </w:rPr>
-        <w:t xml:space="preserve">opt/pi-2026-09-22</w:t>
+        <w:t xml:space="preserve">Everything-good-(sound+audio)</w:t>
       </w:r>
       <w:r>
         <w:rPr>
@@ -8742,7 +8759,7 @@
                 <w:sz w:val="17"/>
                 <w:szCs w:val="17"/>
               </w:rPr>
-              <w:t xml:space="preserve">opt/pi-2026-09-22</w:t>
+              <w:t xml:space="preserve">Everything-good-(sound+audio)</w:t>
             </w:r>
             <w:r>
               <w:rPr>
@@ -9599,14 +9616,14 @@
           <w:sz w:val="17"/>
           <w:szCs w:val="17"/>
         </w:rPr>
-        <w:t xml:space="preserve">gh workflow run build-image.yml --ref opt/pi-2026-09-22 -f draft=true</w:t>
+        <w:t xml:space="preserve">gh workflow run build-image.yml --ref 'Everything-good-(sound+audio)' -f draft=true</w:t>
       </w:r>
       <w:r>
         <w:rPr>
           <w:b w:val="false"/>
           <w:bCs w:val="false"/>
         </w:rPr>
-        <w:t xml:space="preserve">.</w:t>
+        <w:t xml:space="preserve"> (keep the quotes: the name has brackets).</w:t>
       </w:r>
     </w:p>
     <w:p>

</xml_diff>